<commit_message>
Remove GitHub profile from CV contact details
Co-authored-by: hmesquita-soap <hmesquita-soap@users.noreply.github.com>
</commit_message>
<xml_diff>
--- a/cv/Higor-Mesquita-CV.docx
+++ b/cv/Higor-Mesquita-CV.docx
@@ -60,25 +60,6 @@
             <w:u w:val="single"/>
           </w:rPr>
           <w:t>linkedin.com/in/higor-mesquita</w:t>
-        </w:r>
-      </w:hyperlink>
-      <w:r>
-        <w:rPr>
-          <w:b w:val="0"/>
-          <w:i w:val="0"/>
-          <w:color w:val="444444"/>
-          <w:sz w:val="17"/>
-        </w:rPr>
-        <w:t xml:space="preserve">   ·   </w:t>
-      </w:r>
-      <w:hyperlink r:id="rId10">
-        <w:r>
-          <w:rPr>
-            <w:color w:val="1A1A1A"/>
-            <w:sz w:val="17"/>
-            <w:u w:val="single"/>
-          </w:rPr>
-          <w:t>github.com/Mesquitigor</w:t>
         </w:r>
       </w:hyperlink>
     </w:p>
@@ -1263,7 +1244,7 @@
       </w:r>
     </w:p>
     <w:sectPr>
-      <w:footerReference w:type="default" r:id="rId11"/>
+      <w:footerReference w:type="default" r:id="rId10"/>
       <w:pgSz w:w="12240" w:h="15840"/>
       <w:pgMar w:top="737" w:right="907" w:bottom="737" w:left="907" w:header="720" w:footer="720" w:gutter="0"/>
       <w:cols w:space="720"/>

</xml_diff>

<commit_message>
Correct current role details and regroup core skills
Current role: company renamed to MEDOME, title reduced to QA Engineer,
test count corrected to 900+, and the Vitest bullet now reflects fixing
existing tests rather than writing them.

Propagated the consequences so the CV does not contradict itself: the
tech lead claims are gone from the summary and the mentoring bullet, the
headline no longer says Senior, and the suite total is now 2,100+, which
matches 900 plus 1,200 in the body.

Core skills regrouped so each line holds one kind of thing. AWS moved
out of a catch-all next to ClickUp and into infrastructure, trace and
video artifacts moved out of CI/CD into a reporting and debugging group,
and performance tools now sit with the testing type they serve.

Co-authored-by: hmesquita-soap <hmesquita-soap@users.noreply.github.com>
</commit_message>
<xml_diff>
--- a/cv/Higor-Mesquita-CV.docx
+++ b/cv/Higor-Mesquita-CV.docx
@@ -29,7 +29,7 @@
           <w:color w:val="444444"/>
           <w:sz w:val="18"/>
         </w:rPr>
-        <w:t>Senior QA Engineer  |  SDET  |  AI-Assisted Test Automation  |  Playwright · TypeScript · Cursor · MCP</w:t>
+        <w:t>QA Engineer  |  SDET  |  AI-Assisted Test Automation  |  Playwright · TypeScript · Cursor · MCP</w:t>
       </w:r>
     </w:p>
     <w:p>
@@ -91,7 +91,7 @@
           <w:color w:val="1A1A1A"/>
           <w:sz w:val="19"/>
         </w:rPr>
-        <w:t>Senior QA Engineer and SDET with 5+ years designing test automation for AI-powered healthcare, digital payments, banking, and e-commerce platforms. Specialist in Playwright with TypeScript, combining two complementary strengths: validating AI and GenAI features for correctness and consistency, and applying AI-augmented quality engineering with Cursor and Playwright MCP to accelerate test design, authoring, and failure triage. Built automated test suites from the ground up, totaling 1,600+ tests, automated 20+ end-to-end services, and cut regression execution time by 40%. Acts as QA Tech Lead, setting automation standards, owning CI/CD quality gates, and mentoring engineers to deliver automation independently.</w:t>
+        <w:t>QA Engineer and SDET with 5+ years designing test automation for AI-powered healthcare, digital payments, banking, and e-commerce platforms. Specialist in Playwright with TypeScript, combining two complementary strengths: validating AI and GenAI features for correctness and consistency, and applying AI-augmented quality engineering with Cursor and Playwright MCP to accelerate test design, authoring, and failure triage. Built automated test suites from the ground up, totaling 2,100+ test cases, automated 20+ end-to-end services, and cut regression execution time by 40%. Works across web, API, mobile, and database layers, contributing to CI/CD pipelines and keeping suites stable through disciplined locator strategy and Page Object Model architecture.</w:t>
       </w:r>
     </w:p>
     <w:p>
@@ -132,7 +132,7 @@
           <w:color w:val="1A1A1A"/>
           <w:sz w:val="19"/>
         </w:rPr>
-        <w:t>Playwright (TypeScript), Cypress (JavaScript), Robot Framework (Python), Selenium, Appium, Vitest, Page Object Model, fixtures, BDD and Gherkin (Cucumber)</w:t>
+        <w:t>Playwright (TypeScript), Cypress (JavaScript), Robot Framework (Python), Selenium, Appium, Vitest, Page Object Model, BDD and Gherkin (Cucumber)</w:t>
       </w:r>
     </w:p>
     <w:p>
@@ -156,7 +156,7 @@
           <w:color w:val="1A1A1A"/>
           <w:sz w:val="19"/>
         </w:rPr>
-        <w:t>Validation of AI and GenAI features for correctness, safety, and consistency; detection of hallucinations, inconsistent outputs, and edge cases; schema and business-rule assertions over non-deterministic output; prompt and model regression; golden datasets</w:t>
+        <w:t>Validation of AI and GenAI features for correctness, safety, and consistency; detection of hallucinations, inconsistent outputs, and edge cases; schema and business-rule assertions over non-deterministic output</w:t>
       </w:r>
     </w:p>
     <w:p>
@@ -204,7 +204,7 @@
           <w:color w:val="1A1A1A"/>
           <w:sz w:val="19"/>
         </w:rPr>
-        <w:t>End-to-end, API, regression, integration, performance and load, mobile, cross-browser, accessibility (WCAG), visual regression, exploratory</w:t>
+        <w:t>End-to-end, API, regression, integration, mobile, cross-browser, accessibility (WCAG), visual regression, exploratory, performance and load (k6, JMeter)</w:t>
       </w:r>
     </w:p>
     <w:p>
@@ -228,7 +228,7 @@
           <w:color w:val="1A1A1A"/>
           <w:sz w:val="19"/>
         </w:rPr>
-        <w:t>GitHub Actions, Jenkins, Docker, Linux, test sharding and parallelization, Allure, trace and video artifact analysis</w:t>
+        <w:t>GitHub Actions, Jenkins, Git, Docker, Linux, AWS (basic), test sharding and parallelization</w:t>
       </w:r>
     </w:p>
     <w:p>
@@ -243,7 +243,7 @@
           <w:color w:val="1A1A1A"/>
           <w:sz w:val="19"/>
         </w:rPr>
-        <w:t xml:space="preserve">Data and Tools — </w:t>
+        <w:t xml:space="preserve">Databases and APIs — </w:t>
       </w:r>
       <w:r>
         <w:rPr>
@@ -252,7 +252,7 @@
           <w:color w:val="1A1A1A"/>
           <w:sz w:val="19"/>
         </w:rPr>
-        <w:t>SQL, PostgreSQL, DBeaver, REST APIs, Postman, k6, JMeter, Git, Jira, ClickUp, AWS (basic)</w:t>
+        <w:t>SQL, PostgreSQL, DBeaver, REST APIs, Postman</w:t>
       </w:r>
     </w:p>
     <w:p>
@@ -267,7 +267,7 @@
           <w:color w:val="1A1A1A"/>
           <w:sz w:val="19"/>
         </w:rPr>
-        <w:t xml:space="preserve">Practices — </w:t>
+        <w:t xml:space="preserve">Reporting and Debugging — </w:t>
       </w:r>
       <w:r>
         <w:rPr>
@@ -276,7 +276,31 @@
           <w:color w:val="1A1A1A"/>
           <w:sz w:val="19"/>
         </w:rPr>
-        <w:t>Scrum, Kanban, shift-left testing, risk-based testing, test strategy, quality governance, technical mentoring</w:t>
+        <w:t>Allure, Playwright trace viewer and video artifacts, flaky test analysis, defect reporting</w:t>
+      </w:r>
+    </w:p>
+    <w:p>
+      <w:pPr>
+        <w:spacing w:before="0" w:after="80"/>
+        <w:ind w:left="255" w:hanging="255"/>
+      </w:pPr>
+      <w:r>
+        <w:rPr>
+          <w:b/>
+          <w:i w:val="0"/>
+          <w:color w:val="1A1A1A"/>
+          <w:sz w:val="19"/>
+        </w:rPr>
+        <w:t xml:space="preserve">Process and Collaboration — </w:t>
+      </w:r>
+      <w:r>
+        <w:rPr>
+          <w:b w:val="0"/>
+          <w:i w:val="0"/>
+          <w:color w:val="1A1A1A"/>
+          <w:sz w:val="19"/>
+        </w:rPr>
+        <w:t>Jira, ClickUp, Scrum, Kanban, shift-left testing, risk-based testing, test strategy</w:t>
       </w:r>
     </w:p>
     <w:p>
@@ -312,7 +336,7 @@
           <w:color w:val="1A1A1A"/>
           <w:sz w:val="19"/>
         </w:rPr>
-        <w:t>SOAP HEALTH</w:t>
+        <w:t>MEDOME</w:t>
       </w:r>
       <w:r>
         <w:rPr>
@@ -330,7 +354,7 @@
           <w:color w:val="1A1A1A"/>
           <w:sz w:val="19"/>
         </w:rPr>
-        <w:t>Senior QA Engineer &amp; QA Tech Lead</w:t>
+        <w:t>QA Engineer</w:t>
       </w:r>
       <w:r>
         <w:rPr>
@@ -394,7 +418,7 @@
           <w:color w:val="1A1A1A"/>
           <w:sz w:val="19"/>
         </w:rPr>
-        <w:t>Built the automation practice from zero to 400+ Playwright and TypeScript tests covering critical clinical journeys, edge cases, and backend authentication flows.</w:t>
+        <w:t>Built the automation suite from zero to 900+ Playwright and TypeScript test cases covering critical clinical journeys and edge cases.</w:t>
       </w:r>
     </w:p>
     <w:p>
@@ -424,7 +448,7 @@
           <w:color w:val="1A1A1A"/>
           <w:sz w:val="19"/>
         </w:rPr>
-        <w:t>Own the quality of AI-assisted clinical features, validating non-deterministic model outputs through schema and business-rule assertions, plus regression checks on prompt and model changes.</w:t>
+        <w:t>Test AI-assisted clinical features, validating non-deterministic model outputs through schema and business-rule assertions.</w:t>
       </w:r>
     </w:p>
     <w:p>
@@ -454,7 +478,7 @@
           <w:color w:val="1A1A1A"/>
           <w:sz w:val="19"/>
         </w:rPr>
-        <w:t>Lead the QA team as technical mentor, running training on Playwright fundamentals, Git workflows, code quality, dependency management, and CI/CD, taking members from zero automation experience to independent test delivery.</w:t>
+        <w:t>Re-architected the legacy suite into Page Object Model with a locator strategy based on roles and test IDs, reducing flaky failures and CI re-runs.</w:t>
       </w:r>
     </w:p>
     <w:p>
@@ -484,7 +508,7 @@
           <w:color w:val="1A1A1A"/>
           <w:sz w:val="19"/>
         </w:rPr>
-        <w:t>Re-architected the legacy suite into Page Object Model with fixtures and a locator strategy based on roles and test IDs, reducing flaky failures and CI re-runs.</w:t>
+        <w:t>Use Cursor and Playwright MCP for test scaffolding, refactoring, and CI failure triage, shortening test authoring and debugging cycles.</w:t>
       </w:r>
     </w:p>
     <w:p>
@@ -514,7 +538,7 @@
           <w:color w:val="1A1A1A"/>
           <w:sz w:val="19"/>
         </w:rPr>
-        <w:t>Introduced AI-augmented workflows with Cursor and Playwright MCP for test scaffolding, refactoring, and CI failure triage, shortening test authoring and debugging cycles.</w:t>
+        <w:t>Contribute to CI/CD pipelines in GitHub Actions, using Allure reports to analyze failures and improve test reliability.</w:t>
       </w:r>
     </w:p>
     <w:p>
@@ -544,7 +568,7 @@
           <w:color w:val="1A1A1A"/>
           <w:sz w:val="19"/>
         </w:rPr>
-        <w:t>Own CI quality gates in GitHub Actions with parallelized runs and Allure reporting, turning failure analysis into a repeatable, artifact-driven process.</w:t>
+        <w:t>Fix existing Vitest unit and integration tests when feature work or refactors break them.</w:t>
       </w:r>
     </w:p>
     <w:p>
@@ -574,7 +598,7 @@
           <w:color w:val="1A1A1A"/>
           <w:sz w:val="19"/>
         </w:rPr>
-        <w:t>Write unit and integration tests in Vitest alongside developers to shift quality left and catch defects before end-to-end execution.</w:t>
+        <w:t>Validate complex API integrations and backend authentication flows.</w:t>
       </w:r>
     </w:p>
     <w:p>
@@ -603,7 +627,7 @@
           <w:color w:val="1A1A1A"/>
           <w:sz w:val="19"/>
         </w:rPr>
-        <w:t>Run a traceable QA process in Jira and ClickUp, from requirement to test case to defect.</w:t>
+        <w:t>Manage tasks and bugs in Jira and ClickUp, keeping QA work traceable from requirement to test case to defect.</w:t>
       </w:r>
     </w:p>
     <w:p>

</xml_diff>

<commit_message>
Drop Vitest from core skills and round suite total to 2,000+
Vitest stays only in the bullet about fixing existing tests, which is
the actual scope of the work.

Co-authored-by: hmesquita-soap <hmesquita-soap@users.noreply.github.com>
</commit_message>
<xml_diff>
--- a/cv/Higor-Mesquita-CV.docx
+++ b/cv/Higor-Mesquita-CV.docx
@@ -91,7 +91,7 @@
           <w:color w:val="1A1A1A"/>
           <w:sz w:val="19"/>
         </w:rPr>
-        <w:t>QA Engineer and SDET with 5+ years designing test automation for AI-powered healthcare, digital payments, banking, and e-commerce platforms. Specialist in Playwright with TypeScript, combining two complementary strengths: validating AI and GenAI features for correctness and consistency, and applying AI-augmented quality engineering with Cursor and Playwright MCP to accelerate test design, authoring, and failure triage. Built automated test suites from the ground up, totaling 2,100+ test cases, automated 20+ end-to-end services, and cut regression execution time by 40%. Works across web, API, mobile, and database layers, contributing to CI/CD pipelines and keeping suites stable through disciplined locator strategy and Page Object Model architecture.</w:t>
+        <w:t>QA Engineer and SDET with 5+ years designing test automation for AI-powered healthcare, digital payments, banking, and e-commerce platforms. Specialist in Playwright with TypeScript, combining two complementary strengths: validating AI and GenAI features for correctness and consistency, and applying AI-augmented quality engineering with Cursor and Playwright MCP to accelerate test design, authoring, and failure triage. Built automated test suites from the ground up, totaling 2,000+ test cases, automated 20+ end-to-end services, and cut regression execution time by 40%. Works across web, API, mobile, and database layers, contributing to CI/CD pipelines and keeping suites stable through disciplined locator strategy and Page Object Model architecture.</w:t>
       </w:r>
     </w:p>
     <w:p>
@@ -132,7 +132,7 @@
           <w:color w:val="1A1A1A"/>
           <w:sz w:val="19"/>
         </w:rPr>
-        <w:t>Playwright (TypeScript), Cypress (JavaScript), Robot Framework (Python), Selenium, Appium, Vitest, Page Object Model, BDD and Gherkin (Cucumber)</w:t>
+        <w:t>Playwright (TypeScript), Cypress (JavaScript), Robot Framework (Python), Selenium, Appium, Page Object Model, BDD and Gherkin (Cucumber)</w:t>
       </w:r>
     </w:p>
     <w:p>

</xml_diff>

<commit_message>
Condense core skills from eight prose blocks to four keyword lines
Co-authored-by: hmesquita-soap <hmesquita-soap@users.noreply.github.com>
</commit_message>
<xml_diff>
--- a/cv/Higor-Mesquita-CV.docx
+++ b/cv/Higor-Mesquita-CV.docx
@@ -123,7 +123,7 @@
           <w:color w:val="1A1A1A"/>
           <w:sz w:val="19"/>
         </w:rPr>
-        <w:t xml:space="preserve">Test Automation — </w:t>
+        <w:t xml:space="preserve">Automation — </w:t>
       </w:r>
       <w:r>
         <w:rPr>
@@ -132,7 +132,7 @@
           <w:color w:val="1A1A1A"/>
           <w:sz w:val="19"/>
         </w:rPr>
-        <w:t>Playwright (TypeScript), Cypress (JavaScript), Robot Framework (Python), Selenium, Appium, Page Object Model, BDD and Gherkin (Cucumber)</w:t>
+        <w:t>Playwright, Cypress, Robot Framework, Selenium, Appium, TypeScript, JavaScript, Python, Java, Page Object Model, BDD &amp; Gherkin</w:t>
       </w:r>
     </w:p>
     <w:p>
@@ -147,7 +147,7 @@
           <w:color w:val="1A1A1A"/>
           <w:sz w:val="19"/>
         </w:rPr>
-        <w:t xml:space="preserve">AI Product Testing — </w:t>
+        <w:t xml:space="preserve">AI in Testing — </w:t>
       </w:r>
       <w:r>
         <w:rPr>
@@ -156,7 +156,7 @@
           <w:color w:val="1A1A1A"/>
           <w:sz w:val="19"/>
         </w:rPr>
-        <w:t>Validation of AI and GenAI features for correctness, safety, and consistency; detection of hallucinations, inconsistent outputs, and edge cases; schema and business-rule assertions over non-deterministic output</w:t>
+        <w:t>AI/GenAI feature validation, hallucination detection, non-deterministic output assertions, Cursor, Cursor Rules, Playwright MCP, prompt engineering, AI-assisted test generation</w:t>
       </w:r>
     </w:p>
     <w:p>
@@ -171,7 +171,7 @@
           <w:color w:val="1A1A1A"/>
           <w:sz w:val="19"/>
         </w:rPr>
-        <w:t xml:space="preserve">AI-Augmented QA — </w:t>
+        <w:t xml:space="preserve">Testing &amp; Data — </w:t>
       </w:r>
       <w:r>
         <w:rPr>
@@ -180,7 +180,7 @@
           <w:color w:val="1A1A1A"/>
           <w:sz w:val="19"/>
         </w:rPr>
-        <w:t>Cursor (test authoring, refactoring, and CI failure triage), Cursor Rules, Playwright MCP, prompt engineering, AI-assisted test generation from requirements, user stories, and acceptance criteria</w:t>
+        <w:t>E2E, API, regression, integration, mobile, cross-browser, accessibility (WCAG), visual regression, performance (k6, JMeter), SQL, PostgreSQL, DBeaver, Postman</w:t>
       </w:r>
     </w:p>
     <w:p>
@@ -195,7 +195,7 @@
           <w:color w:val="1A1A1A"/>
           <w:sz w:val="19"/>
         </w:rPr>
-        <w:t xml:space="preserve">Testing Types — </w:t>
+        <w:t xml:space="preserve">CI/CD &amp; Tools — </w:t>
       </w:r>
       <w:r>
         <w:rPr>
@@ -204,103 +204,7 @@
           <w:color w:val="1A1A1A"/>
           <w:sz w:val="19"/>
         </w:rPr>
-        <w:t>End-to-end, API, regression, integration, mobile, cross-browser, accessibility (WCAG), visual regression, exploratory, performance and load (k6, JMeter)</w:t>
-      </w:r>
-    </w:p>
-    <w:p>
-      <w:pPr>
-        <w:spacing w:before="0" w:after="80"/>
-        <w:ind w:left="255" w:hanging="255"/>
-      </w:pPr>
-      <w:r>
-        <w:rPr>
-          <w:b/>
-          <w:i w:val="0"/>
-          <w:color w:val="1A1A1A"/>
-          <w:sz w:val="19"/>
-        </w:rPr>
-        <w:t xml:space="preserve">CI/CD and Infrastructure — </w:t>
-      </w:r>
-      <w:r>
-        <w:rPr>
-          <w:b w:val="0"/>
-          <w:i w:val="0"/>
-          <w:color w:val="1A1A1A"/>
-          <w:sz w:val="19"/>
-        </w:rPr>
-        <w:t>GitHub Actions, Jenkins, Git, Docker, Linux, AWS (basic), test sharding and parallelization</w:t>
-      </w:r>
-    </w:p>
-    <w:p>
-      <w:pPr>
-        <w:spacing w:before="0" w:after="80"/>
-        <w:ind w:left="255" w:hanging="255"/>
-      </w:pPr>
-      <w:r>
-        <w:rPr>
-          <w:b/>
-          <w:i w:val="0"/>
-          <w:color w:val="1A1A1A"/>
-          <w:sz w:val="19"/>
-        </w:rPr>
-        <w:t xml:space="preserve">Databases and APIs — </w:t>
-      </w:r>
-      <w:r>
-        <w:rPr>
-          <w:b w:val="0"/>
-          <w:i w:val="0"/>
-          <w:color w:val="1A1A1A"/>
-          <w:sz w:val="19"/>
-        </w:rPr>
-        <w:t>SQL, PostgreSQL, DBeaver, REST APIs, Postman</w:t>
-      </w:r>
-    </w:p>
-    <w:p>
-      <w:pPr>
-        <w:spacing w:before="0" w:after="80"/>
-        <w:ind w:left="255" w:hanging="255"/>
-      </w:pPr>
-      <w:r>
-        <w:rPr>
-          <w:b/>
-          <w:i w:val="0"/>
-          <w:color w:val="1A1A1A"/>
-          <w:sz w:val="19"/>
-        </w:rPr>
-        <w:t xml:space="preserve">Reporting and Debugging — </w:t>
-      </w:r>
-      <w:r>
-        <w:rPr>
-          <w:b w:val="0"/>
-          <w:i w:val="0"/>
-          <w:color w:val="1A1A1A"/>
-          <w:sz w:val="19"/>
-        </w:rPr>
-        <w:t>Allure, Playwright trace viewer and video artifacts, flaky test analysis, defect reporting</w:t>
-      </w:r>
-    </w:p>
-    <w:p>
-      <w:pPr>
-        <w:spacing w:before="0" w:after="80"/>
-        <w:ind w:left="255" w:hanging="255"/>
-      </w:pPr>
-      <w:r>
-        <w:rPr>
-          <w:b/>
-          <w:i w:val="0"/>
-          <w:color w:val="1A1A1A"/>
-          <w:sz w:val="19"/>
-        </w:rPr>
-        <w:t xml:space="preserve">Process and Collaboration — </w:t>
-      </w:r>
-      <w:r>
-        <w:rPr>
-          <w:b w:val="0"/>
-          <w:i w:val="0"/>
-          <w:color w:val="1A1A1A"/>
-          <w:sz w:val="19"/>
-        </w:rPr>
-        <w:t>Jira, ClickUp, Scrum, Kanban, shift-left testing, risk-based testing, test strategy</w:t>
+        <w:t>GitHub Actions, Jenkins, Git, Docker, Linux, AWS (basic), Allure, Jira, ClickUp, Scrum, Kanban</w:t>
       </w:r>
     </w:p>
     <w:p>

</xml_diff>